<commit_message>
update features, add quarterly rural-loan tools, tests, and design docs
</commit_message>
<xml_diff>
--- a/README.docx
+++ b/README.docx
@@ -979,15 +979,8 @@
             <w:vAlign w:val="center"/>
           </w:tcPr>
           <w:p>
-            <w:pPr>
-              <w:spacing w:after="40"/>
-            </w:pPr>
-            <w:r>
-              <w:rPr>
-                <w:rFonts w:ascii="Microsoft YaHei" w:hAnsi="Microsoft YaHei" w:eastAsia="Microsoft YaHei"/>
-                <w:sz w:val="17"/>
-              </w:rPr>
-              <w:t>配置要批量提取哪些工作表或哪些行列区域。</w:t>
+            <w:r>
+              <w:t>按工作簿关键字和工作表关键字匹配，支持单区域/多区域提取、横向拼接或纵向追加，并可配置输出文件夹和文件名。</w:t>
             </w:r>
           </w:p>
         </w:tc>
@@ -11640,7 +11633,150 @@
         </w:tc>
       </w:tr>
     </w:tbl>
-    <w:p/>
+    <w:p>
+      <w:pPr/>
+    </w:p>
+    <w:p>
+      <w:pPr>
+        <w:pStyle w:val="Heading3"/>
+      </w:pPr>
+      <w:r>
+        <w:t>6.3 生成校验规则（校验规则生成配置）</w:t>
+      </w:r>
+    </w:p>
+    <w:p>
+      <w:pPr/>
+      <w:r>
+        <w:t>用途：优先使用的自动生成方式。适合报表结构规范、校验关系里的指标编号可以直接在报表里找到的情况。</w:t>
+      </w:r>
+    </w:p>
+    <w:p>
+      <w:pPr/>
+      <w:r>
+        <w:t>准备文件：1）包含正式报表 Sheet 的报表工作簿；2）包含“校验关系”列的校验关系工作簿。</w:t>
+      </w:r>
+    </w:p>
+    <w:p>
+      <w:pPr/>
+      <w:r>
+        <w:t>报表工作簿要求：每个参与生成规则的 Sheet 应能识别出表名（如 表8-1）、Sheet 名里的口径/年份（如 S0801_J_26）、列编号（A/B/C）、行编号、指标名称（如 1.资产、1.1 子项）。</w:t>
+      </w:r>
+    </w:p>
+    <w:p>
+      <w:pPr/>
+      <w:r>
+        <w:t>校验关系示例：1=1.1+1.2；跨表可写 表8-1_1.C=表8-2_1.1.A。未写列号时，程序会按报表中的列编号自动展开。</w:t>
+      </w:r>
+    </w:p>
+    <w:p>
+      <w:pPr/>
+      <w:r>
+        <w:t>配置方式：在 config.xlsx 的“校验规则生成配置”中只启用一行。常用填写：是否启用=Y，口径筛选可空或填 D;F;J/J，表头搜索最大行一般填 20，默认规则类型可填“勾稽关系不平衡错误”，输出文件名可空。</w:t>
+      </w:r>
+    </w:p>
+    <w:p>
+      <w:pPr/>
+      <w:r>
+        <w:t>运行方式：菜单选择 6 汇总工具 -&gt; 3 生成校验规则。按提示先选择报表工作簿，再选择校验关系工作簿。</w:t>
+      </w:r>
+    </w:p>
+    <w:p>
+      <w:pPr/>
+      <w:r>
+        <w:t>输出结果：output 目录下生成“校验规则生成结果.xlsx”，包含“校验规则”和“未生成明细”两个 Sheet。未生成明细用于查看找不到指标、找不到口径 Sheet、列编号不存在、关系式格式无法解析等原因。</w:t>
+      </w:r>
+    </w:p>
+    <w:p>
+      <w:pPr>
+        <w:pStyle w:val="Heading3"/>
+      </w:pPr>
+      <w:r>
+        <w:t>6.4 按映射生成校验规则（校验规则映射表）</w:t>
+      </w:r>
+    </w:p>
+    <w:p>
+      <w:pPr/>
+      <w:r>
+        <w:t>用途：6.3 的兜底方式。适合自动识别不稳定，或者需要人工明确指定“关系式编号对应哪个表格、行号、默认列号”的情况。</w:t>
+      </w:r>
+    </w:p>
+    <w:p>
+      <w:pPr/>
+      <w:r>
+        <w:t>使用前先维护 config.xlsx 的“校验规则映射表”。关键列包括：是否启用、校验关系Sheet、口径、年份、表格名称、表格编码、指标前缀、实际行编号、默认列编号、备注。</w:t>
+      </w:r>
+    </w:p>
+    <w:p>
+      <w:pPr/>
+      <w:r>
+        <w:t>字段说明：校验关系Sheet 必须等于校验关系工作簿中的 Sheet 名；表格名称填 表8-1 这类名称；表格编码填 S0801_J_26 这类正式 Sheet 编码；指标前缀填关系式里的 1、1.1、2 等；实际行编号填正式规则中的行号；默认列编号用于关系式未写列号时补列，通常填 A。</w:t>
+      </w:r>
+    </w:p>
+    <w:p>
+      <w:pPr/>
+      <w:r>
+        <w:t>映射表示例：Y | 表8-1 | J | 26 | 表8-1 | S0801_J_26 | 1 | 1 | A | 资产。对应关系式 1=1.1+1.2 可生成 [S0801_J_26_001_A]=[S0801_J_26_002_A]+[S0801_J_26_003_A]。</w:t>
+      </w:r>
+    </w:p>
+    <w:p>
+      <w:pPr/>
+      <w:r>
+        <w:t>运行方式：菜单选择 6 汇总工具 -&gt; 4 按映射生成校验规则。按提示选择校验关系工作簿。</w:t>
+      </w:r>
+    </w:p>
+    <w:p>
+      <w:pPr/>
+      <w:r>
+        <w:t>注意事项：如果关系式里写了跨表，如 表8-2_1.1.A，映射表里也必须存在 表8-2 + 1.1 对应的行。若关系式未写列号，映射表必须填写默认列编号。</w:t>
+      </w:r>
+    </w:p>
+    <w:p>
+      <w:pPr>
+        <w:pStyle w:val="Heading3"/>
+      </w:pPr>
+      <w:r>
+        <w:t>6.5 生成校验规则映射表（供6-4使用）</w:t>
+      </w:r>
+    </w:p>
+    <w:p>
+      <w:pPr/>
+      <w:r>
+        <w:t>用途：辅助生成 6.4 需要的“校验规则映射表”，减少人工逐行填写。</w:t>
+      </w:r>
+    </w:p>
+    <w:p>
+      <w:pPr/>
+      <w:r>
+        <w:t>运行方式：菜单选择 6 汇总工具 -&gt; 5 生成校验规则映射表。按提示选择包含报表 Sheet 的表格工作簿。</w:t>
+      </w:r>
+    </w:p>
+    <w:p>
+      <w:pPr/>
+      <w:r>
+        <w:t>生成逻辑：程序复用 6.3 的报表识别逻辑，从报表 Sheet 中读取表名、口径、年份、表格编码、指标前缀、实际行编号、列编号，并输出为 6.4 可读取的映射表格式。</w:t>
+      </w:r>
+    </w:p>
+    <w:p>
+      <w:pPr/>
+      <w:r>
+        <w:t>输出结果：output 目录下生成“校验规则映射表.xlsx”，其中包含“校验规则映射表”和“未生成明细”。可以将“校验规则映射表”中的内容复制到 config.xlsx 的同名 Sheet，再根据实际校验关系调整“校验关系Sheet”“默认列编号”等字段。</w:t>
+      </w:r>
+    </w:p>
+    <w:p>
+      <w:pPr/>
+      <w:r>
+        <w:t>推荐流程：先运行 6.3；若存在未生成项，再运行 6.5 生成映射表；把映射行复制到 config.xlsx 的“校验规则映射表”并必要时调整；最后运行 6.4 兜底生成规则。</w:t>
+      </w:r>
+    </w:p>
+    <w:p>
+      <w:pPr/>
+      <w:r>
+        <w:t>简单记法：6.3=自动生成规则；6.4=按映射表兜底生成规则；6.5=自动生成 6.4 要用的映射表。</w:t>
+      </w:r>
+    </w:p>
+    <w:p>
+      <w:pPr/>
+    </w:p>
     <w:p>
       <w:pPr>
         <w:pStyle w:val="Heading1"/>
@@ -13502,15 +13638,8 @@
             <w:vAlign w:val="center"/>
           </w:tcPr>
           <w:p>
-            <w:pPr>
-              <w:spacing w:after="40"/>
-            </w:pPr>
-            <w:r>
-              <w:rPr>
-                <w:rFonts w:ascii="Microsoft YaHei" w:hAnsi="Microsoft YaHei" w:eastAsia="Microsoft YaHei"/>
-                <w:sz w:val="17"/>
-              </w:rPr>
-              <w:t>工作表提取。</w:t>
+            <w:r>
+              <w:t>工作表提取：是否启用、工作簿关键字、工作表关键字、排除关键字、提取区域、多区域拼接方式、输出文件夹、文件名。关键词语法：分号/中文分号表示必须同时命中；逗号/中文逗号/| 表示同组任选；排除关键字命中源文件名或 Sheet 名时跳过。</w:t>
             </w:r>
           </w:p>
         </w:tc>
@@ -13553,15 +13682,8 @@
             <w:vAlign w:val="center"/>
           </w:tcPr>
           <w:p>
-            <w:pPr>
-              <w:spacing w:after="40"/>
-            </w:pPr>
-            <w:r>
-              <w:rPr>
-                <w:rFonts w:ascii="Microsoft YaHei" w:hAnsi="Microsoft YaHei" w:eastAsia="Microsoft YaHei"/>
-                <w:sz w:val="17"/>
-              </w:rPr>
-              <w:t>多选源工作簿。</w:t>
+            <w:r>
+              <w:t>多选源工作簿；程序自动按文件扩展名路由，xls 走 COM，其它 Excel 走普通处理。</w:t>
             </w:r>
           </w:p>
         </w:tc>
@@ -13604,15 +13726,8 @@
             <w:vAlign w:val="center"/>
           </w:tcPr>
           <w:p>
-            <w:pPr>
-              <w:spacing w:after="40"/>
-            </w:pPr>
-            <w:r>
-              <w:rPr>
-                <w:rFonts w:ascii="Microsoft YaHei" w:hAnsi="Microsoft YaHei" w:eastAsia="Microsoft YaHei"/>
-                <w:sz w:val="17"/>
-              </w:rPr>
-              <w:t>按配置批量抽取指定工作表或指定行列区域，合并到新工作簿。</w:t>
+            <w:r>
+              <w:t>先用工作簿关键字匹配文件名，再用工作表关键字匹配 Sheet 名；两列条件之间也是同时满足。单格关键词支持 AND/OR：分号或中文分号分隔必需关键词组，逗号、中文逗号或 | 分隔同组可选词。例如“专项二批;商业银行共享二批”要求两个都在文件名中，“本外币,人民币;涉农”表示 Sheet 名需包含“本外币或人民币”且包含“涉农”。排除关键字会同时检查源文件名和 Sheet 名，命中则跳过该文件或该 Sheet。提取区域支持整表、A1:D20、A:D、1:10，也支持多个区域；多区域可横向拼接或纵向追加。整表尽量保留格式，指定区域按值提取。</w:t>
             </w:r>
           </w:p>
         </w:tc>
@@ -13655,15 +13770,8 @@
             <w:vAlign w:val="center"/>
           </w:tcPr>
           <w:p>
-            <w:pPr>
-              <w:spacing w:after="40"/>
-            </w:pPr>
-            <w:r>
-              <w:rPr>
-                <w:rFonts w:ascii="Microsoft YaHei" w:hAnsi="Microsoft YaHei" w:eastAsia="Microsoft YaHei"/>
-                <w:sz w:val="17"/>
-              </w:rPr>
-              <w:t>在 output 生成提取结果。</w:t>
+            <w:r>
+              <w:t>输出到配置的输出文件夹；空则使用默认 output。文件名为空时自动生成“提取结果_时间戳.xlsx”；多条规则使用同一文件名时会合并到同一工作簿，Sheet 重名自动加后缀。</w:t>
             </w:r>
           </w:p>
         </w:tc>

</xml_diff>